<commit_message>
Adding Finance with Excel notes
</commit_message>
<xml_diff>
--- a/Finance-And-Accounting-In-Excel/Finance-Notes-01.docx
+++ b/Finance-And-Accounting-In-Excel/Finance-Notes-01.docx
@@ -485,6 +485,241 @@
         </w:rPr>
         <w:t>================================================</w:t>
       </w:r>
+    </w:p>
+    <w:p>
+      <w:pPr>
+        <w:rPr>
+          <w:rFonts w:ascii="Sakkal Majalla" w:hAnsi="Sakkal Majalla" w:cs="Sakkal Majalla"/>
+          <w:sz w:val="28"/>
+          <w:szCs w:val="28"/>
+        </w:rPr>
+      </w:pPr>
+      <w:r>
+        <w:rPr>
+          <w:rFonts w:ascii="Sakkal Majalla" w:hAnsi="Sakkal Majalla" w:cs="Sakkal Majalla"/>
+          <w:sz w:val="28"/>
+          <w:szCs w:val="28"/>
+        </w:rPr>
+        <w:t>To set</w:t>
+      </w:r>
+      <w:r>
+        <w:rPr>
+          <w:rFonts w:ascii="Sakkal Majalla" w:hAnsi="Sakkal Majalla" w:cs="Sakkal Majalla"/>
+          <w:sz w:val="28"/>
+          <w:szCs w:val="28"/>
+        </w:rPr>
+        <w:t xml:space="preserve"> an</w:t>
+      </w:r>
+      <w:r>
+        <w:rPr>
+          <w:rFonts w:ascii="Sakkal Majalla" w:hAnsi="Sakkal Majalla" w:cs="Sakkal Majalla"/>
+          <w:sz w:val="28"/>
+          <w:szCs w:val="28"/>
+        </w:rPr>
+        <w:t xml:space="preserve"> absolute reference for </w:t>
+      </w:r>
+      <w:r>
+        <w:rPr>
+          <w:rFonts w:ascii="Sakkal Majalla" w:hAnsi="Sakkal Majalla" w:cs="Sakkal Majalla"/>
+          <w:sz w:val="28"/>
+          <w:szCs w:val="28"/>
+        </w:rPr>
+        <w:t xml:space="preserve">a </w:t>
+      </w:r>
+      <w:r>
+        <w:rPr>
+          <w:rFonts w:ascii="Sakkal Majalla" w:hAnsi="Sakkal Majalla" w:cs="Sakkal Majalla"/>
+          <w:sz w:val="28"/>
+          <w:szCs w:val="28"/>
+        </w:rPr>
+        <w:t>specific cell:</w:t>
+      </w:r>
+    </w:p>
+    <w:p>
+      <w:pPr>
+        <w:rPr>
+          <w:rFonts w:ascii="Sakkal Majalla" w:hAnsi="Sakkal Majalla" w:cs="Sakkal Majalla"/>
+          <w:sz w:val="28"/>
+          <w:szCs w:val="28"/>
+        </w:rPr>
+      </w:pPr>
+      <w:r>
+        <w:rPr>
+          <w:rFonts w:ascii="Sakkal Majalla" w:hAnsi="Sakkal Majalla" w:cs="Sakkal Majalla"/>
+          <w:sz w:val="28"/>
+          <w:szCs w:val="28"/>
+        </w:rPr>
+        <w:t xml:space="preserve">Note: also, we can press F4 from the keyboard to add </w:t>
+      </w:r>
+      <w:r>
+        <w:rPr>
+          <w:rFonts w:ascii="Sakkal Majalla" w:hAnsi="Sakkal Majalla" w:cs="Sakkal Majalla"/>
+          <w:sz w:val="28"/>
+          <w:szCs w:val="28"/>
+        </w:rPr>
+        <w:t xml:space="preserve">an </w:t>
+      </w:r>
+      <w:r>
+        <w:rPr>
+          <w:rFonts w:ascii="Sakkal Majalla" w:hAnsi="Sakkal Majalla" w:cs="Sakkal Majalla"/>
+          <w:sz w:val="28"/>
+          <w:szCs w:val="28"/>
+        </w:rPr>
+        <w:t>absolute reference</w:t>
+      </w:r>
+      <w:r>
+        <w:rPr>
+          <w:rFonts w:ascii="Sakkal Majalla" w:hAnsi="Sakkal Majalla" w:cs="Sakkal Majalla"/>
+          <w:sz w:val="28"/>
+          <w:szCs w:val="28"/>
+        </w:rPr>
+        <w:t xml:space="preserve"> once or multiple times</w:t>
+      </w:r>
+    </w:p>
+    <w:p>
+      <w:pPr>
+        <w:jc w:val="center"/>
+        <w:rPr>
+          <w:rFonts w:ascii="Sakkal Majalla" w:hAnsi="Sakkal Majalla" w:cs="Sakkal Majalla"/>
+          <w:sz w:val="28"/>
+          <w:szCs w:val="28"/>
+        </w:rPr>
+      </w:pPr>
+      <w:r>
+        <w:rPr>
+          <w:noProof/>
+        </w:rPr>
+        <w:drawing>
+          <wp:inline distT="0" distB="0" distL="0" distR="0" wp14:anchorId="67AEAAB8" wp14:editId="6A1B6206">
+            <wp:extent cx="4787869" cy="2562225"/>
+            <wp:effectExtent l="0" t="0" r="0" b="0"/>
+            <wp:docPr id="2097966948" name="Picture 1"/>
+            <wp:cNvGraphicFramePr>
+              <a:graphicFrameLocks xmlns:a="http://schemas.openxmlformats.org/drawingml/2006/main" noChangeAspect="1"/>
+            </wp:cNvGraphicFramePr>
+            <a:graphic xmlns:a="http://schemas.openxmlformats.org/drawingml/2006/main">
+              <a:graphicData uri="http://schemas.openxmlformats.org/drawingml/2006/picture">
+                <pic:pic xmlns:pic="http://schemas.openxmlformats.org/drawingml/2006/picture">
+                  <pic:nvPicPr>
+                    <pic:cNvPr id="2097966948" name=""/>
+                    <pic:cNvPicPr/>
+                  </pic:nvPicPr>
+                  <pic:blipFill>
+                    <a:blip r:embed="rId9"/>
+                    <a:stretch>
+                      <a:fillRect/>
+                    </a:stretch>
+                  </pic:blipFill>
+                  <pic:spPr>
+                    <a:xfrm>
+                      <a:off x="0" y="0"/>
+                      <a:ext cx="4816935" cy="2577779"/>
+                    </a:xfrm>
+                    <a:prstGeom prst="rect">
+                      <a:avLst/>
+                    </a:prstGeom>
+                  </pic:spPr>
+                </pic:pic>
+              </a:graphicData>
+            </a:graphic>
+          </wp:inline>
+        </w:drawing>
+      </w:r>
+    </w:p>
+    <w:p>
+      <w:pPr>
+        <w:ind w:left="1440" w:firstLine="720"/>
+        <w:rPr>
+          <w:rFonts w:ascii="Sakkal Majalla" w:hAnsi="Sakkal Majalla" w:cs="Sakkal Majalla"/>
+          <w:sz w:val="28"/>
+          <w:szCs w:val="28"/>
+        </w:rPr>
+      </w:pPr>
+      <w:r>
+        <w:rPr>
+          <w:rFonts w:ascii="Sakkal Majalla" w:hAnsi="Sakkal Majalla" w:cs="Sakkal Majalla"/>
+          <w:sz w:val="28"/>
+          <w:szCs w:val="28"/>
+        </w:rPr>
+        <w:t>================================================</w:t>
+      </w:r>
+    </w:p>
+    <w:p>
+      <w:pPr>
+        <w:rPr>
+          <w:rFonts w:ascii="Sakkal Majalla" w:hAnsi="Sakkal Majalla" w:cs="Sakkal Majalla"/>
+          <w:sz w:val="28"/>
+          <w:szCs w:val="28"/>
+        </w:rPr>
+      </w:pPr>
+      <w:r>
+        <w:rPr>
+          <w:noProof/>
+        </w:rPr>
+        <w:lastRenderedPageBreak/>
+        <w:drawing>
+          <wp:inline distT="0" distB="0" distL="0" distR="0" wp14:anchorId="3CC229FB" wp14:editId="3E8C7F8F">
+            <wp:extent cx="6621849" cy="3533775"/>
+            <wp:effectExtent l="0" t="0" r="7620" b="0"/>
+            <wp:docPr id="329949070" name="Picture 1"/>
+            <wp:cNvGraphicFramePr>
+              <a:graphicFrameLocks xmlns:a="http://schemas.openxmlformats.org/drawingml/2006/main" noChangeAspect="1"/>
+            </wp:cNvGraphicFramePr>
+            <a:graphic xmlns:a="http://schemas.openxmlformats.org/drawingml/2006/main">
+              <a:graphicData uri="http://schemas.openxmlformats.org/drawingml/2006/picture">
+                <pic:pic xmlns:pic="http://schemas.openxmlformats.org/drawingml/2006/picture">
+                  <pic:nvPicPr>
+                    <pic:cNvPr id="329949070" name=""/>
+                    <pic:cNvPicPr/>
+                  </pic:nvPicPr>
+                  <pic:blipFill>
+                    <a:blip r:embed="rId10"/>
+                    <a:stretch>
+                      <a:fillRect/>
+                    </a:stretch>
+                  </pic:blipFill>
+                  <pic:spPr>
+                    <a:xfrm>
+                      <a:off x="0" y="0"/>
+                      <a:ext cx="6627712" cy="3536904"/>
+                    </a:xfrm>
+                    <a:prstGeom prst="rect">
+                      <a:avLst/>
+                    </a:prstGeom>
+                  </pic:spPr>
+                </pic:pic>
+              </a:graphicData>
+            </a:graphic>
+          </wp:inline>
+        </w:drawing>
+      </w:r>
+    </w:p>
+    <w:p>
+      <w:pPr>
+        <w:ind w:left="1440" w:firstLine="720"/>
+        <w:rPr>
+          <w:rFonts w:ascii="Sakkal Majalla" w:hAnsi="Sakkal Majalla" w:cs="Sakkal Majalla"/>
+          <w:sz w:val="28"/>
+          <w:szCs w:val="28"/>
+        </w:rPr>
+      </w:pPr>
+      <w:r>
+        <w:rPr>
+          <w:rFonts w:ascii="Sakkal Majalla" w:hAnsi="Sakkal Majalla" w:cs="Sakkal Majalla"/>
+          <w:sz w:val="28"/>
+          <w:szCs w:val="28"/>
+        </w:rPr>
+        <w:t>================================================</w:t>
+      </w:r>
+    </w:p>
+    <w:p>
+      <w:pPr>
+        <w:rPr>
+          <w:rFonts w:ascii="Sakkal Majalla" w:hAnsi="Sakkal Majalla" w:cs="Sakkal Majalla"/>
+          <w:sz w:val="28"/>
+          <w:szCs w:val="28"/>
+        </w:rPr>
+      </w:pPr>
     </w:p>
     <w:p>
       <w:pPr>

</xml_diff>

<commit_message>
Adding Finance & Excel notes
</commit_message>
<xml_diff>
--- a/Finance-And-Accounting-In-Excel/Finance-Notes-01.docx
+++ b/Finance-And-Accounting-In-Excel/Finance-Notes-01.docx
@@ -125,7 +125,7 @@
                     <pic:cNvPicPr/>
                   </pic:nvPicPr>
                   <pic:blipFill>
-                    <a:blip r:embed="rId4"/>
+                    <a:blip r:embed="rId5"/>
                     <a:stretch>
                       <a:fillRect/>
                     </a:stretch>
@@ -211,7 +211,7 @@
                     <pic:cNvPicPr/>
                   </pic:nvPicPr>
                   <pic:blipFill>
-                    <a:blip r:embed="rId5"/>
+                    <a:blip r:embed="rId6"/>
                     <a:stretch>
                       <a:fillRect/>
                     </a:stretch>
@@ -279,7 +279,7 @@
                     <pic:cNvPicPr/>
                   </pic:nvPicPr>
                   <pic:blipFill>
-                    <a:blip r:embed="rId6"/>
+                    <a:blip r:embed="rId7"/>
                     <a:stretch>
                       <a:fillRect/>
                     </a:stretch>
@@ -346,7 +346,7 @@
                     <pic:cNvPicPr/>
                   </pic:nvPicPr>
                   <pic:blipFill>
-                    <a:blip r:embed="rId7"/>
+                    <a:blip r:embed="rId8"/>
                     <a:stretch>
                       <a:fillRect/>
                     </a:stretch>
@@ -447,7 +447,7 @@
                     <pic:cNvPicPr/>
                   </pic:nvPicPr>
                   <pic:blipFill>
-                    <a:blip r:embed="rId8"/>
+                    <a:blip r:embed="rId9"/>
                     <a:stretch>
                       <a:fillRect/>
                     </a:stretch>
@@ -549,7 +549,23 @@
           <w:sz w:val="28"/>
           <w:szCs w:val="28"/>
         </w:rPr>
-        <w:t xml:space="preserve">Note: also, we can press F4 from the keyboard to add </w:t>
+        <w:t xml:space="preserve">Note: </w:t>
+      </w:r>
+      <w:r>
+        <w:rPr>
+          <w:rFonts w:ascii="Sakkal Majalla" w:hAnsi="Sakkal Majalla" w:cs="Sakkal Majalla"/>
+          <w:sz w:val="28"/>
+          <w:szCs w:val="28"/>
+        </w:rPr>
+        <w:t>Also</w:t>
+      </w:r>
+      <w:r>
+        <w:rPr>
+          <w:rFonts w:ascii="Sakkal Majalla" w:hAnsi="Sakkal Majalla" w:cs="Sakkal Majalla"/>
+          <w:sz w:val="28"/>
+          <w:szCs w:val="28"/>
+        </w:rPr>
+        <w:t xml:space="preserve">, we can press F4 from the keyboard to add </w:t>
       </w:r>
       <w:r>
         <w:rPr>
@@ -605,7 +621,7 @@
                     <pic:cNvPicPr/>
                   </pic:nvPicPr>
                   <pic:blipFill>
-                    <a:blip r:embed="rId9"/>
+                    <a:blip r:embed="rId10"/>
                     <a:stretch>
                       <a:fillRect/>
                     </a:stretch>
@@ -673,7 +689,7 @@
                     <pic:cNvPicPr/>
                   </pic:nvPicPr>
                   <pic:blipFill>
-                    <a:blip r:embed="rId10"/>
+                    <a:blip r:embed="rId11"/>
                     <a:stretch>
                       <a:fillRect/>
                     </a:stretch>
@@ -720,6 +736,1141 @@
           <w:szCs w:val="28"/>
         </w:rPr>
       </w:pPr>
+      <w:r>
+        <w:rPr>
+          <w:rFonts w:ascii="Sakkal Majalla" w:hAnsi="Sakkal Majalla" w:cs="Sakkal Majalla"/>
+          <w:sz w:val="28"/>
+          <w:szCs w:val="28"/>
+        </w:rPr>
+        <w:t xml:space="preserve">If we want to sort all the data from oldest to newest, we must select the data from the date field </w:t>
+      </w:r>
+      <w:r>
+        <w:rPr>
+          <w:rFonts w:ascii="Sakkal Majalla" w:hAnsi="Sakkal Majalla" w:cs="Sakkal Majalla"/>
+          <w:sz w:val="28"/>
+          <w:szCs w:val="28"/>
+        </w:rPr>
+        <w:t>in</w:t>
+      </w:r>
+      <w:r>
+        <w:rPr>
+          <w:rFonts w:ascii="Sakkal Majalla" w:hAnsi="Sakkal Majalla" w:cs="Sakkal Majalla"/>
+          <w:sz w:val="28"/>
+          <w:szCs w:val="28"/>
+        </w:rPr>
+        <w:t xml:space="preserve"> </w:t>
+      </w:r>
+      <w:r>
+        <w:rPr>
+          <w:rFonts w:ascii="Sakkal Majalla" w:hAnsi="Sakkal Majalla" w:cs="Sakkal Majalla"/>
+          <w:sz w:val="28"/>
+          <w:szCs w:val="28"/>
+        </w:rPr>
+        <w:t>the</w:t>
+      </w:r>
+      <w:r>
+        <w:rPr>
+          <w:rFonts w:ascii="Sakkal Majalla" w:hAnsi="Sakkal Majalla" w:cs="Sakkal Majalla"/>
+          <w:sz w:val="28"/>
+          <w:szCs w:val="28"/>
+        </w:rPr>
+        <w:t xml:space="preserve"> </w:t>
+      </w:r>
+      <w:r>
+        <w:rPr>
+          <w:rFonts w:ascii="Sakkal Majalla" w:hAnsi="Sakkal Majalla" w:cs="Sakkal Majalla"/>
+          <w:sz w:val="28"/>
+          <w:szCs w:val="28"/>
+        </w:rPr>
+        <w:t>entire table</w:t>
+      </w:r>
+      <w:r>
+        <w:rPr>
+          <w:rFonts w:ascii="Sakkal Majalla" w:hAnsi="Sakkal Majalla" w:cs="Sakkal Majalla"/>
+          <w:sz w:val="28"/>
+          <w:szCs w:val="28"/>
+        </w:rPr>
+        <w:t>,</w:t>
+      </w:r>
+      <w:r>
+        <w:rPr>
+          <w:rFonts w:ascii="Sakkal Majalla" w:hAnsi="Sakkal Majalla" w:cs="Sakkal Majalla"/>
+          <w:sz w:val="28"/>
+          <w:szCs w:val="28"/>
+        </w:rPr>
+        <w:t xml:space="preserve"> t</w:t>
+      </w:r>
+      <w:r>
+        <w:rPr>
+          <w:rFonts w:ascii="Sakkal Majalla" w:hAnsi="Sakkal Majalla" w:cs="Sakkal Majalla"/>
+          <w:sz w:val="28"/>
+          <w:szCs w:val="28"/>
+        </w:rPr>
+        <w:t>hen</w:t>
+      </w:r>
+      <w:r>
+        <w:rPr>
+          <w:rFonts w:ascii="Sakkal Majalla" w:hAnsi="Sakkal Majalla" w:cs="Sakkal Majalla"/>
+          <w:sz w:val="28"/>
+          <w:szCs w:val="28"/>
+        </w:rPr>
+        <w:t xml:space="preserve"> </w:t>
+      </w:r>
+      <w:r>
+        <w:rPr>
+          <w:rFonts w:ascii="Sakkal Majalla" w:hAnsi="Sakkal Majalla" w:cs="Sakkal Majalla"/>
+          <w:sz w:val="28"/>
+          <w:szCs w:val="28"/>
+        </w:rPr>
+        <w:t xml:space="preserve">choose </w:t>
+      </w:r>
+      <w:r>
+        <w:rPr>
+          <w:rFonts w:ascii="Sakkal Majalla" w:hAnsi="Sakkal Majalla" w:cs="Sakkal Majalla"/>
+          <w:sz w:val="28"/>
+          <w:szCs w:val="28"/>
+        </w:rPr>
+        <w:t>S</w:t>
+      </w:r>
+      <w:r>
+        <w:rPr>
+          <w:rFonts w:ascii="Sakkal Majalla" w:hAnsi="Sakkal Majalla" w:cs="Sakkal Majalla"/>
+          <w:sz w:val="28"/>
+          <w:szCs w:val="28"/>
+        </w:rPr>
+        <w:t xml:space="preserve">ort or </w:t>
+      </w:r>
+      <w:r>
+        <w:rPr>
+          <w:rFonts w:ascii="Sakkal Majalla" w:hAnsi="Sakkal Majalla" w:cs="Sakkal Majalla"/>
+          <w:sz w:val="28"/>
+          <w:szCs w:val="28"/>
+        </w:rPr>
+        <w:t>F</w:t>
+      </w:r>
+      <w:r>
+        <w:rPr>
+          <w:rFonts w:ascii="Sakkal Majalla" w:hAnsi="Sakkal Majalla" w:cs="Sakkal Majalla"/>
+          <w:sz w:val="28"/>
+          <w:szCs w:val="28"/>
+        </w:rPr>
+        <w:t>ilter and select “</w:t>
+      </w:r>
+      <w:r>
+        <w:rPr>
+          <w:rFonts w:ascii="Sakkal Majalla" w:hAnsi="Sakkal Majalla" w:cs="Sakkal Majalla"/>
+          <w:b/>
+          <w:bCs/>
+          <w:color w:val="C00000"/>
+          <w:sz w:val="28"/>
+          <w:szCs w:val="28"/>
+        </w:rPr>
+        <w:t>Sort from oldest to newest</w:t>
+      </w:r>
+      <w:r>
+        <w:rPr>
+          <w:rFonts w:ascii="Sakkal Majalla" w:hAnsi="Sakkal Majalla" w:cs="Sakkal Majalla"/>
+          <w:sz w:val="28"/>
+          <w:szCs w:val="28"/>
+        </w:rPr>
+        <w:t>”.</w:t>
+      </w:r>
+    </w:p>
+    <w:p>
+      <w:pPr>
+        <w:rPr>
+          <w:rFonts w:ascii="Sakkal Majalla" w:hAnsi="Sakkal Majalla" w:cs="Sakkal Majalla"/>
+          <w:sz w:val="28"/>
+          <w:szCs w:val="28"/>
+        </w:rPr>
+      </w:pPr>
+      <w:r>
+        <w:rPr>
+          <w:noProof/>
+        </w:rPr>
+        <w:lastRenderedPageBreak/>
+        <w:drawing>
+          <wp:inline distT="0" distB="0" distL="0" distR="0" wp14:anchorId="400FA5DE" wp14:editId="3BDEB289">
+            <wp:extent cx="6715125" cy="3617989"/>
+            <wp:effectExtent l="0" t="0" r="0" b="1905"/>
+            <wp:docPr id="195990150" name="Picture 1"/>
+            <wp:cNvGraphicFramePr>
+              <a:graphicFrameLocks xmlns:a="http://schemas.openxmlformats.org/drawingml/2006/main" noChangeAspect="1"/>
+            </wp:cNvGraphicFramePr>
+            <a:graphic xmlns:a="http://schemas.openxmlformats.org/drawingml/2006/main">
+              <a:graphicData uri="http://schemas.openxmlformats.org/drawingml/2006/picture">
+                <pic:pic xmlns:pic="http://schemas.openxmlformats.org/drawingml/2006/picture">
+                  <pic:nvPicPr>
+                    <pic:cNvPr id="195990150" name=""/>
+                    <pic:cNvPicPr/>
+                  </pic:nvPicPr>
+                  <pic:blipFill>
+                    <a:blip r:embed="rId12"/>
+                    <a:stretch>
+                      <a:fillRect/>
+                    </a:stretch>
+                  </pic:blipFill>
+                  <pic:spPr>
+                    <a:xfrm>
+                      <a:off x="0" y="0"/>
+                      <a:ext cx="6731070" cy="3626580"/>
+                    </a:xfrm>
+                    <a:prstGeom prst="rect">
+                      <a:avLst/>
+                    </a:prstGeom>
+                  </pic:spPr>
+                </pic:pic>
+              </a:graphicData>
+            </a:graphic>
+          </wp:inline>
+        </w:drawing>
+      </w:r>
+    </w:p>
+    <w:p>
+      <w:pPr>
+        <w:ind w:left="1440" w:firstLine="720"/>
+        <w:rPr>
+          <w:rFonts w:ascii="Sakkal Majalla" w:hAnsi="Sakkal Majalla" w:cs="Sakkal Majalla"/>
+          <w:sz w:val="28"/>
+          <w:szCs w:val="28"/>
+        </w:rPr>
+      </w:pPr>
+      <w:r>
+        <w:rPr>
+          <w:rFonts w:ascii="Sakkal Majalla" w:hAnsi="Sakkal Majalla" w:cs="Sakkal Majalla"/>
+          <w:sz w:val="28"/>
+          <w:szCs w:val="28"/>
+        </w:rPr>
+        <w:t>================================================</w:t>
+      </w:r>
+    </w:p>
+    <w:p>
+      <w:pPr>
+        <w:rPr>
+          <w:rFonts w:ascii="Sakkal Majalla" w:hAnsi="Sakkal Majalla" w:cs="Sakkal Majalla"/>
+          <w:sz w:val="28"/>
+          <w:szCs w:val="28"/>
+        </w:rPr>
+      </w:pPr>
+      <w:r>
+        <w:rPr>
+          <w:rFonts w:ascii="Sakkal Majalla" w:hAnsi="Sakkal Majalla" w:cs="Sakkal Majalla"/>
+          <w:sz w:val="28"/>
+          <w:szCs w:val="28"/>
+        </w:rPr>
+        <w:t>After we select all the table data, we can choose Sort or Filter, then choose “Custom Sort”</w:t>
+      </w:r>
+      <w:r>
+        <w:rPr>
+          <w:rFonts w:ascii="Sakkal Majalla" w:hAnsi="Sakkal Majalla" w:cs="Sakkal Majalla"/>
+          <w:sz w:val="28"/>
+          <w:szCs w:val="28"/>
+        </w:rPr>
+        <w:t>.</w:t>
+      </w:r>
+    </w:p>
+    <w:p>
+      <w:pPr>
+        <w:rPr>
+          <w:rFonts w:ascii="Sakkal Majalla" w:hAnsi="Sakkal Majalla" w:cs="Sakkal Majalla"/>
+          <w:sz w:val="28"/>
+          <w:szCs w:val="28"/>
+        </w:rPr>
+      </w:pPr>
+      <w:r>
+        <w:rPr>
+          <w:noProof/>
+        </w:rPr>
+        <w:drawing>
+          <wp:inline distT="0" distB="0" distL="0" distR="0" wp14:anchorId="6D0704F7" wp14:editId="7FB0B0C9">
+            <wp:extent cx="6581215" cy="3314700"/>
+            <wp:effectExtent l="0" t="0" r="0" b="0"/>
+            <wp:docPr id="1357633468" name="Picture 1"/>
+            <wp:cNvGraphicFramePr>
+              <a:graphicFrameLocks xmlns:a="http://schemas.openxmlformats.org/drawingml/2006/main" noChangeAspect="1"/>
+            </wp:cNvGraphicFramePr>
+            <a:graphic xmlns:a="http://schemas.openxmlformats.org/drawingml/2006/main">
+              <a:graphicData uri="http://schemas.openxmlformats.org/drawingml/2006/picture">
+                <pic:pic xmlns:pic="http://schemas.openxmlformats.org/drawingml/2006/picture">
+                  <pic:nvPicPr>
+                    <pic:cNvPr id="1357633468" name=""/>
+                    <pic:cNvPicPr/>
+                  </pic:nvPicPr>
+                  <pic:blipFill>
+                    <a:blip r:embed="rId13"/>
+                    <a:stretch>
+                      <a:fillRect/>
+                    </a:stretch>
+                  </pic:blipFill>
+                  <pic:spPr>
+                    <a:xfrm>
+                      <a:off x="0" y="0"/>
+                      <a:ext cx="6593836" cy="3321057"/>
+                    </a:xfrm>
+                    <a:prstGeom prst="rect">
+                      <a:avLst/>
+                    </a:prstGeom>
+                  </pic:spPr>
+                </pic:pic>
+              </a:graphicData>
+            </a:graphic>
+          </wp:inline>
+        </w:drawing>
+      </w:r>
+    </w:p>
+    <w:p>
+      <w:pPr>
+        <w:ind w:left="1440" w:firstLine="720"/>
+        <w:rPr>
+          <w:rFonts w:ascii="Sakkal Majalla" w:hAnsi="Sakkal Majalla" w:cs="Sakkal Majalla"/>
+          <w:sz w:val="28"/>
+          <w:szCs w:val="28"/>
+        </w:rPr>
+      </w:pPr>
+      <w:r>
+        <w:rPr>
+          <w:rFonts w:ascii="Sakkal Majalla" w:hAnsi="Sakkal Majalla" w:cs="Sakkal Majalla"/>
+          <w:sz w:val="28"/>
+          <w:szCs w:val="28"/>
+        </w:rPr>
+        <w:t>================================================</w:t>
+      </w:r>
+    </w:p>
+    <w:p>
+      <w:pPr>
+        <w:rPr>
+          <w:rFonts w:ascii="Sakkal Majalla" w:hAnsi="Sakkal Majalla" w:cs="Sakkal Majalla"/>
+          <w:sz w:val="28"/>
+          <w:szCs w:val="28"/>
+        </w:rPr>
+      </w:pPr>
+      <w:r>
+        <w:rPr>
+          <w:noProof/>
+        </w:rPr>
+        <w:lastRenderedPageBreak/>
+        <w:drawing>
+          <wp:inline distT="0" distB="0" distL="0" distR="0" wp14:anchorId="2FF90811" wp14:editId="291D9D8F">
+            <wp:extent cx="6746789" cy="3600450"/>
+            <wp:effectExtent l="0" t="0" r="0" b="0"/>
+            <wp:docPr id="1749925101" name="Picture 1"/>
+            <wp:cNvGraphicFramePr>
+              <a:graphicFrameLocks xmlns:a="http://schemas.openxmlformats.org/drawingml/2006/main" noChangeAspect="1"/>
+            </wp:cNvGraphicFramePr>
+            <a:graphic xmlns:a="http://schemas.openxmlformats.org/drawingml/2006/main">
+              <a:graphicData uri="http://schemas.openxmlformats.org/drawingml/2006/picture">
+                <pic:pic xmlns:pic="http://schemas.openxmlformats.org/drawingml/2006/picture">
+                  <pic:nvPicPr>
+                    <pic:cNvPr id="1749925101" name=""/>
+                    <pic:cNvPicPr/>
+                  </pic:nvPicPr>
+                  <pic:blipFill>
+                    <a:blip r:embed="rId14"/>
+                    <a:stretch>
+                      <a:fillRect/>
+                    </a:stretch>
+                  </pic:blipFill>
+                  <pic:spPr>
+                    <a:xfrm>
+                      <a:off x="0" y="0"/>
+                      <a:ext cx="6754077" cy="3604339"/>
+                    </a:xfrm>
+                    <a:prstGeom prst="rect">
+                      <a:avLst/>
+                    </a:prstGeom>
+                  </pic:spPr>
+                </pic:pic>
+              </a:graphicData>
+            </a:graphic>
+          </wp:inline>
+        </w:drawing>
+      </w:r>
+    </w:p>
+    <w:p>
+      <w:pPr>
+        <w:ind w:left="1440" w:firstLine="720"/>
+        <w:rPr>
+          <w:rFonts w:ascii="Sakkal Majalla" w:hAnsi="Sakkal Majalla" w:cs="Sakkal Majalla"/>
+          <w:sz w:val="28"/>
+          <w:szCs w:val="28"/>
+        </w:rPr>
+      </w:pPr>
+      <w:r>
+        <w:rPr>
+          <w:rFonts w:ascii="Sakkal Majalla" w:hAnsi="Sakkal Majalla" w:cs="Sakkal Majalla"/>
+          <w:sz w:val="28"/>
+          <w:szCs w:val="28"/>
+        </w:rPr>
+        <w:t>================================================</w:t>
+      </w:r>
+    </w:p>
+    <w:p>
+      <w:pPr>
+        <w:rPr>
+          <w:rFonts w:ascii="Sakkal Majalla" w:hAnsi="Sakkal Majalla" w:cs="Sakkal Majalla"/>
+          <w:sz w:val="28"/>
+          <w:szCs w:val="28"/>
+        </w:rPr>
+      </w:pPr>
+      <w:r>
+        <w:rPr>
+          <w:noProof/>
+        </w:rPr>
+        <w:drawing>
+          <wp:inline distT="0" distB="0" distL="0" distR="0" wp14:anchorId="773FB587" wp14:editId="533FA3C1">
+            <wp:extent cx="6585585" cy="3686175"/>
+            <wp:effectExtent l="0" t="0" r="5715" b="9525"/>
+            <wp:docPr id="105484720" name="Picture 1"/>
+            <wp:cNvGraphicFramePr>
+              <a:graphicFrameLocks xmlns:a="http://schemas.openxmlformats.org/drawingml/2006/main" noChangeAspect="1"/>
+            </wp:cNvGraphicFramePr>
+            <a:graphic xmlns:a="http://schemas.openxmlformats.org/drawingml/2006/main">
+              <a:graphicData uri="http://schemas.openxmlformats.org/drawingml/2006/picture">
+                <pic:pic xmlns:pic="http://schemas.openxmlformats.org/drawingml/2006/picture">
+                  <pic:nvPicPr>
+                    <pic:cNvPr id="105484720" name=""/>
+                    <pic:cNvPicPr/>
+                  </pic:nvPicPr>
+                  <pic:blipFill>
+                    <a:blip r:embed="rId15"/>
+                    <a:stretch>
+                      <a:fillRect/>
+                    </a:stretch>
+                  </pic:blipFill>
+                  <pic:spPr>
+                    <a:xfrm>
+                      <a:off x="0" y="0"/>
+                      <a:ext cx="6593200" cy="3690437"/>
+                    </a:xfrm>
+                    <a:prstGeom prst="rect">
+                      <a:avLst/>
+                    </a:prstGeom>
+                  </pic:spPr>
+                </pic:pic>
+              </a:graphicData>
+            </a:graphic>
+          </wp:inline>
+        </w:drawing>
+      </w:r>
+    </w:p>
+    <w:p>
+      <w:pPr>
+        <w:ind w:left="1440" w:firstLine="720"/>
+        <w:rPr>
+          <w:rFonts w:ascii="Sakkal Majalla" w:hAnsi="Sakkal Majalla" w:cs="Sakkal Majalla"/>
+          <w:sz w:val="28"/>
+          <w:szCs w:val="28"/>
+        </w:rPr>
+      </w:pPr>
+      <w:r>
+        <w:rPr>
+          <w:rFonts w:ascii="Sakkal Majalla" w:hAnsi="Sakkal Majalla" w:cs="Sakkal Majalla"/>
+          <w:sz w:val="28"/>
+          <w:szCs w:val="28"/>
+        </w:rPr>
+        <w:t>================================================</w:t>
+      </w:r>
+    </w:p>
+    <w:p>
+      <w:pPr>
+        <w:rPr>
+          <w:rFonts w:ascii="Sakkal Majalla" w:hAnsi="Sakkal Majalla" w:cs="Sakkal Majalla"/>
+          <w:sz w:val="28"/>
+          <w:szCs w:val="28"/>
+        </w:rPr>
+      </w:pPr>
+      <w:r>
+        <w:rPr>
+          <w:rFonts w:ascii="Sakkal Majalla" w:hAnsi="Sakkal Majalla" w:cs="Sakkal Majalla"/>
+          <w:sz w:val="28"/>
+          <w:szCs w:val="28"/>
+        </w:rPr>
+        <w:lastRenderedPageBreak/>
+        <w:t>The number filters for checking the data:</w:t>
+      </w:r>
+    </w:p>
+    <w:p>
+      <w:pPr>
+        <w:rPr>
+          <w:rFonts w:ascii="Sakkal Majalla" w:hAnsi="Sakkal Majalla" w:cs="Sakkal Majalla"/>
+          <w:sz w:val="28"/>
+          <w:szCs w:val="28"/>
+        </w:rPr>
+      </w:pPr>
+      <w:r>
+        <w:rPr>
+          <w:noProof/>
+        </w:rPr>
+        <w:drawing>
+          <wp:inline distT="0" distB="0" distL="0" distR="0" wp14:anchorId="6772D8ED" wp14:editId="715B3EEC">
+            <wp:extent cx="6711092" cy="3581400"/>
+            <wp:effectExtent l="0" t="0" r="0" b="0"/>
+            <wp:docPr id="1243144003" name="Picture 1"/>
+            <wp:cNvGraphicFramePr>
+              <a:graphicFrameLocks xmlns:a="http://schemas.openxmlformats.org/drawingml/2006/main" noChangeAspect="1"/>
+            </wp:cNvGraphicFramePr>
+            <a:graphic xmlns:a="http://schemas.openxmlformats.org/drawingml/2006/main">
+              <a:graphicData uri="http://schemas.openxmlformats.org/drawingml/2006/picture">
+                <pic:pic xmlns:pic="http://schemas.openxmlformats.org/drawingml/2006/picture">
+                  <pic:nvPicPr>
+                    <pic:cNvPr id="1243144003" name=""/>
+                    <pic:cNvPicPr/>
+                  </pic:nvPicPr>
+                  <pic:blipFill>
+                    <a:blip r:embed="rId16"/>
+                    <a:stretch>
+                      <a:fillRect/>
+                    </a:stretch>
+                  </pic:blipFill>
+                  <pic:spPr>
+                    <a:xfrm>
+                      <a:off x="0" y="0"/>
+                      <a:ext cx="6718167" cy="3585176"/>
+                    </a:xfrm>
+                    <a:prstGeom prst="rect">
+                      <a:avLst/>
+                    </a:prstGeom>
+                  </pic:spPr>
+                </pic:pic>
+              </a:graphicData>
+            </a:graphic>
+          </wp:inline>
+        </w:drawing>
+      </w:r>
+    </w:p>
+    <w:p>
+      <w:pPr>
+        <w:ind w:left="1440" w:firstLine="720"/>
+        <w:rPr>
+          <w:rFonts w:ascii="Sakkal Majalla" w:hAnsi="Sakkal Majalla" w:cs="Sakkal Majalla"/>
+          <w:sz w:val="28"/>
+          <w:szCs w:val="28"/>
+        </w:rPr>
+      </w:pPr>
+      <w:r>
+        <w:rPr>
+          <w:rFonts w:ascii="Sakkal Majalla" w:hAnsi="Sakkal Majalla" w:cs="Sakkal Majalla"/>
+          <w:sz w:val="28"/>
+          <w:szCs w:val="28"/>
+        </w:rPr>
+        <w:t>================================================</w:t>
+      </w:r>
+    </w:p>
+    <w:p>
+      <w:pPr>
+        <w:rPr>
+          <w:rFonts w:ascii="Sakkal Majalla" w:hAnsi="Sakkal Majalla" w:cs="Sakkal Majalla"/>
+          <w:sz w:val="28"/>
+          <w:szCs w:val="28"/>
+        </w:rPr>
+      </w:pPr>
+      <w:r>
+        <w:rPr>
+          <w:rFonts w:ascii="Sakkal Majalla" w:hAnsi="Sakkal Majalla" w:cs="Sakkal Majalla"/>
+          <w:sz w:val="28"/>
+          <w:szCs w:val="28"/>
+        </w:rPr>
+        <w:t>Filter data depe</w:t>
+      </w:r>
+      <w:r>
+        <w:rPr>
+          <w:rFonts w:ascii="Sakkal Majalla" w:hAnsi="Sakkal Majalla" w:cs="Sakkal Majalla"/>
+          <w:sz w:val="28"/>
+          <w:szCs w:val="28"/>
+        </w:rPr>
+        <w:t>n</w:t>
+      </w:r>
+      <w:r>
+        <w:rPr>
+          <w:rFonts w:ascii="Sakkal Majalla" w:hAnsi="Sakkal Majalla" w:cs="Sakkal Majalla"/>
+          <w:sz w:val="28"/>
+          <w:szCs w:val="28"/>
+        </w:rPr>
+        <w:t>ding on year and month:</w:t>
+      </w:r>
+    </w:p>
+    <w:p>
+      <w:pPr>
+        <w:rPr>
+          <w:rFonts w:ascii="Sakkal Majalla" w:hAnsi="Sakkal Majalla" w:cs="Sakkal Majalla"/>
+          <w:sz w:val="28"/>
+          <w:szCs w:val="28"/>
+        </w:rPr>
+      </w:pPr>
+      <w:r>
+        <w:rPr>
+          <w:noProof/>
+        </w:rPr>
+        <w:drawing>
+          <wp:inline distT="0" distB="0" distL="0" distR="0" wp14:anchorId="35026ABB" wp14:editId="76AC2AE3">
+            <wp:extent cx="6710680" cy="2933700"/>
+            <wp:effectExtent l="0" t="0" r="0" b="0"/>
+            <wp:docPr id="1827175577" name="Picture 1"/>
+            <wp:cNvGraphicFramePr>
+              <a:graphicFrameLocks xmlns:a="http://schemas.openxmlformats.org/drawingml/2006/main" noChangeAspect="1"/>
+            </wp:cNvGraphicFramePr>
+            <a:graphic xmlns:a="http://schemas.openxmlformats.org/drawingml/2006/main">
+              <a:graphicData uri="http://schemas.openxmlformats.org/drawingml/2006/picture">
+                <pic:pic xmlns:pic="http://schemas.openxmlformats.org/drawingml/2006/picture">
+                  <pic:nvPicPr>
+                    <pic:cNvPr id="1827175577" name=""/>
+                    <pic:cNvPicPr/>
+                  </pic:nvPicPr>
+                  <pic:blipFill>
+                    <a:blip r:embed="rId17"/>
+                    <a:stretch>
+                      <a:fillRect/>
+                    </a:stretch>
+                  </pic:blipFill>
+                  <pic:spPr>
+                    <a:xfrm>
+                      <a:off x="0" y="0"/>
+                      <a:ext cx="6710680" cy="2933700"/>
+                    </a:xfrm>
+                    <a:prstGeom prst="rect">
+                      <a:avLst/>
+                    </a:prstGeom>
+                  </pic:spPr>
+                </pic:pic>
+              </a:graphicData>
+            </a:graphic>
+          </wp:inline>
+        </w:drawing>
+      </w:r>
+    </w:p>
+    <w:p>
+      <w:pPr>
+        <w:ind w:left="1440" w:firstLine="720"/>
+        <w:rPr>
+          <w:rFonts w:ascii="Sakkal Majalla" w:hAnsi="Sakkal Majalla" w:cs="Sakkal Majalla"/>
+          <w:sz w:val="28"/>
+          <w:szCs w:val="28"/>
+        </w:rPr>
+      </w:pPr>
+      <w:r>
+        <w:rPr>
+          <w:rFonts w:ascii="Sakkal Majalla" w:hAnsi="Sakkal Majalla" w:cs="Sakkal Majalla"/>
+          <w:sz w:val="28"/>
+          <w:szCs w:val="28"/>
+        </w:rPr>
+        <w:t>================================================</w:t>
+      </w:r>
+    </w:p>
+    <w:p>
+      <w:pPr>
+        <w:rPr>
+          <w:rFonts w:ascii="Sakkal Majalla" w:hAnsi="Sakkal Majalla" w:cs="Sakkal Majalla"/>
+          <w:sz w:val="28"/>
+          <w:szCs w:val="28"/>
+        </w:rPr>
+      </w:pPr>
+      <w:r>
+        <w:rPr>
+          <w:rFonts w:ascii="Sakkal Majalla" w:hAnsi="Sakkal Majalla" w:cs="Sakkal Majalla"/>
+          <w:sz w:val="28"/>
+          <w:szCs w:val="28"/>
+        </w:rPr>
+        <w:lastRenderedPageBreak/>
+        <w:t xml:space="preserve">After we select a cell from the table, we choose Format as table, and select </w:t>
+      </w:r>
+      <w:r>
+        <w:rPr>
+          <w:rFonts w:ascii="Sakkal Majalla" w:hAnsi="Sakkal Majalla" w:cs="Sakkal Majalla"/>
+          <w:sz w:val="28"/>
+          <w:szCs w:val="28"/>
+        </w:rPr>
+        <w:t>w</w:t>
+      </w:r>
+      <w:r>
+        <w:rPr>
+          <w:rFonts w:ascii="Sakkal Majalla" w:hAnsi="Sakkal Majalla" w:cs="Sakkal Majalla"/>
+          <w:sz w:val="28"/>
+          <w:szCs w:val="28"/>
+        </w:rPr>
+        <w:t>h</w:t>
+      </w:r>
+      <w:r>
+        <w:rPr>
+          <w:rFonts w:ascii="Sakkal Majalla" w:hAnsi="Sakkal Majalla" w:cs="Sakkal Majalla"/>
+          <w:sz w:val="28"/>
+          <w:szCs w:val="28"/>
+        </w:rPr>
+        <w:t>ether</w:t>
+      </w:r>
+      <w:r>
+        <w:rPr>
+          <w:rFonts w:ascii="Sakkal Majalla" w:hAnsi="Sakkal Majalla" w:cs="Sakkal Majalla"/>
+          <w:sz w:val="28"/>
+          <w:szCs w:val="28"/>
+        </w:rPr>
+        <w:t xml:space="preserve"> we want the headers or not:</w:t>
+      </w:r>
+    </w:p>
+    <w:p>
+      <w:pPr>
+        <w:rPr>
+          <w:rFonts w:ascii="Sakkal Majalla" w:hAnsi="Sakkal Majalla" w:cs="Sakkal Majalla"/>
+          <w:sz w:val="28"/>
+          <w:szCs w:val="28"/>
+        </w:rPr>
+      </w:pPr>
+      <w:r>
+        <w:rPr>
+          <w:noProof/>
+        </w:rPr>
+        <w:drawing>
+          <wp:inline distT="0" distB="0" distL="0" distR="0" wp14:anchorId="07E9C42F" wp14:editId="6A2CC5EE">
+            <wp:extent cx="6714155" cy="3590925"/>
+            <wp:effectExtent l="0" t="0" r="0" b="0"/>
+            <wp:docPr id="312950435" name="Picture 1"/>
+            <wp:cNvGraphicFramePr>
+              <a:graphicFrameLocks xmlns:a="http://schemas.openxmlformats.org/drawingml/2006/main" noChangeAspect="1"/>
+            </wp:cNvGraphicFramePr>
+            <a:graphic xmlns:a="http://schemas.openxmlformats.org/drawingml/2006/main">
+              <a:graphicData uri="http://schemas.openxmlformats.org/drawingml/2006/picture">
+                <pic:pic xmlns:pic="http://schemas.openxmlformats.org/drawingml/2006/picture">
+                  <pic:nvPicPr>
+                    <pic:cNvPr id="312950435" name=""/>
+                    <pic:cNvPicPr/>
+                  </pic:nvPicPr>
+                  <pic:blipFill>
+                    <a:blip r:embed="rId18"/>
+                    <a:stretch>
+                      <a:fillRect/>
+                    </a:stretch>
+                  </pic:blipFill>
+                  <pic:spPr>
+                    <a:xfrm>
+                      <a:off x="0" y="0"/>
+                      <a:ext cx="6720196" cy="3594156"/>
+                    </a:xfrm>
+                    <a:prstGeom prst="rect">
+                      <a:avLst/>
+                    </a:prstGeom>
+                  </pic:spPr>
+                </pic:pic>
+              </a:graphicData>
+            </a:graphic>
+          </wp:inline>
+        </w:drawing>
+      </w:r>
+    </w:p>
+    <w:p>
+      <w:pPr>
+        <w:ind w:left="1440" w:firstLine="720"/>
+        <w:rPr>
+          <w:rFonts w:ascii="Sakkal Majalla" w:hAnsi="Sakkal Majalla" w:cs="Sakkal Majalla"/>
+          <w:sz w:val="28"/>
+          <w:szCs w:val="28"/>
+        </w:rPr>
+      </w:pPr>
+      <w:r>
+        <w:rPr>
+          <w:rFonts w:ascii="Sakkal Majalla" w:hAnsi="Sakkal Majalla" w:cs="Sakkal Majalla"/>
+          <w:sz w:val="28"/>
+          <w:szCs w:val="28"/>
+        </w:rPr>
+        <w:t>================================================</w:t>
+      </w:r>
+    </w:p>
+    <w:p>
+      <w:pPr>
+        <w:rPr>
+          <w:rFonts w:ascii="Sakkal Majalla" w:hAnsi="Sakkal Majalla" w:cs="Sakkal Majalla"/>
+          <w:sz w:val="28"/>
+          <w:szCs w:val="28"/>
+        </w:rPr>
+      </w:pPr>
+      <w:r>
+        <w:rPr>
+          <w:rFonts w:ascii="Sakkal Majalla" w:hAnsi="Sakkal Majalla" w:cs="Sakkal Majalla"/>
+          <w:sz w:val="28"/>
+          <w:szCs w:val="28"/>
+        </w:rPr>
+        <w:lastRenderedPageBreak/>
+        <w:t>Give the table a name, and select i</w:t>
+      </w:r>
+      <w:r>
+        <w:rPr>
+          <w:rFonts w:ascii="Sakkal Majalla" w:hAnsi="Sakkal Majalla" w:cs="Sakkal Majalla"/>
+          <w:sz w:val="28"/>
+          <w:szCs w:val="28"/>
+        </w:rPr>
+        <w:t>t</w:t>
+      </w:r>
+      <w:r>
+        <w:rPr>
+          <w:rFonts w:ascii="Sakkal Majalla" w:hAnsi="Sakkal Majalla" w:cs="Sakkal Majalla"/>
+          <w:sz w:val="28"/>
+          <w:szCs w:val="28"/>
+        </w:rPr>
+        <w:t>:</w:t>
+      </w:r>
+      <w:r>
+        <w:rPr>
+          <w:noProof/>
+        </w:rPr>
+        <w:drawing>
+          <wp:inline distT="0" distB="0" distL="0" distR="0" wp14:anchorId="74CE5DA1" wp14:editId="4F4819F9">
+            <wp:extent cx="6732984" cy="3590925"/>
+            <wp:effectExtent l="0" t="0" r="0" b="0"/>
+            <wp:docPr id="1317400542" name="Picture 1"/>
+            <wp:cNvGraphicFramePr>
+              <a:graphicFrameLocks xmlns:a="http://schemas.openxmlformats.org/drawingml/2006/main" noChangeAspect="1"/>
+            </wp:cNvGraphicFramePr>
+            <a:graphic xmlns:a="http://schemas.openxmlformats.org/drawingml/2006/main">
+              <a:graphicData uri="http://schemas.openxmlformats.org/drawingml/2006/picture">
+                <pic:pic xmlns:pic="http://schemas.openxmlformats.org/drawingml/2006/picture">
+                  <pic:nvPicPr>
+                    <pic:cNvPr id="1317400542" name=""/>
+                    <pic:cNvPicPr/>
+                  </pic:nvPicPr>
+                  <pic:blipFill>
+                    <a:blip r:embed="rId19"/>
+                    <a:stretch>
+                      <a:fillRect/>
+                    </a:stretch>
+                  </pic:blipFill>
+                  <pic:spPr>
+                    <a:xfrm>
+                      <a:off x="0" y="0"/>
+                      <a:ext cx="6738007" cy="3593604"/>
+                    </a:xfrm>
+                    <a:prstGeom prst="rect">
+                      <a:avLst/>
+                    </a:prstGeom>
+                  </pic:spPr>
+                </pic:pic>
+              </a:graphicData>
+            </a:graphic>
+          </wp:inline>
+        </w:drawing>
+      </w:r>
+    </w:p>
+    <w:p>
+      <w:pPr>
+        <w:ind w:left="1440" w:firstLine="720"/>
+        <w:rPr>
+          <w:rFonts w:ascii="Sakkal Majalla" w:hAnsi="Sakkal Majalla" w:cs="Sakkal Majalla"/>
+          <w:sz w:val="28"/>
+          <w:szCs w:val="28"/>
+        </w:rPr>
+      </w:pPr>
+      <w:r>
+        <w:rPr>
+          <w:rFonts w:ascii="Sakkal Majalla" w:hAnsi="Sakkal Majalla" w:cs="Sakkal Majalla"/>
+          <w:sz w:val="28"/>
+          <w:szCs w:val="28"/>
+        </w:rPr>
+        <w:t>================================================</w:t>
+      </w:r>
+    </w:p>
+    <w:p>
+      <w:pPr>
+        <w:rPr>
+          <w:rFonts w:ascii="Sakkal Majalla" w:hAnsi="Sakkal Majalla" w:cs="Sakkal Majalla"/>
+          <w:sz w:val="28"/>
+          <w:szCs w:val="28"/>
+        </w:rPr>
+      </w:pPr>
+      <w:r>
+        <w:rPr>
+          <w:rFonts w:ascii="Sakkal Majalla" w:hAnsi="Sakkal Majalla" w:cs="Sakkal Majalla"/>
+          <w:sz w:val="28"/>
+          <w:szCs w:val="28"/>
+        </w:rPr>
+        <w:t>To insert a slicer for specific value/s:</w:t>
+      </w:r>
+    </w:p>
+    <w:p>
+      <w:pPr>
+        <w:rPr>
+          <w:rFonts w:ascii="Sakkal Majalla" w:hAnsi="Sakkal Majalla" w:cs="Sakkal Majalla"/>
+          <w:sz w:val="28"/>
+          <w:szCs w:val="28"/>
+        </w:rPr>
+      </w:pPr>
+      <w:r>
+        <w:rPr>
+          <w:noProof/>
+        </w:rPr>
+        <w:drawing>
+          <wp:inline distT="0" distB="0" distL="0" distR="0" wp14:anchorId="2C5B518E" wp14:editId="30CC4D20">
+            <wp:extent cx="6732905" cy="3019231"/>
+            <wp:effectExtent l="0" t="0" r="0" b="0"/>
+            <wp:docPr id="1216717032" name="Picture 1"/>
+            <wp:cNvGraphicFramePr>
+              <a:graphicFrameLocks xmlns:a="http://schemas.openxmlformats.org/drawingml/2006/main" noChangeAspect="1"/>
+            </wp:cNvGraphicFramePr>
+            <a:graphic xmlns:a="http://schemas.openxmlformats.org/drawingml/2006/main">
+              <a:graphicData uri="http://schemas.openxmlformats.org/drawingml/2006/picture">
+                <pic:pic xmlns:pic="http://schemas.openxmlformats.org/drawingml/2006/picture">
+                  <pic:nvPicPr>
+                    <pic:cNvPr id="1216717032" name=""/>
+                    <pic:cNvPicPr/>
+                  </pic:nvPicPr>
+                  <pic:blipFill>
+                    <a:blip r:embed="rId20"/>
+                    <a:stretch>
+                      <a:fillRect/>
+                    </a:stretch>
+                  </pic:blipFill>
+                  <pic:spPr>
+                    <a:xfrm>
+                      <a:off x="0" y="0"/>
+                      <a:ext cx="6763193" cy="3032813"/>
+                    </a:xfrm>
+                    <a:prstGeom prst="rect">
+                      <a:avLst/>
+                    </a:prstGeom>
+                  </pic:spPr>
+                </pic:pic>
+              </a:graphicData>
+            </a:graphic>
+          </wp:inline>
+        </w:drawing>
+      </w:r>
+    </w:p>
+    <w:p>
+      <w:pPr>
+        <w:ind w:left="1440" w:firstLine="720"/>
+        <w:rPr>
+          <w:rFonts w:ascii="Sakkal Majalla" w:hAnsi="Sakkal Majalla" w:cs="Sakkal Majalla"/>
+          <w:sz w:val="28"/>
+          <w:szCs w:val="28"/>
+        </w:rPr>
+      </w:pPr>
+      <w:r>
+        <w:rPr>
+          <w:rFonts w:ascii="Sakkal Majalla" w:hAnsi="Sakkal Majalla" w:cs="Sakkal Majalla"/>
+          <w:sz w:val="28"/>
+          <w:szCs w:val="28"/>
+        </w:rPr>
+        <w:t>================================================</w:t>
+      </w:r>
+    </w:p>
+    <w:p>
+      <w:pPr>
+        <w:rPr>
+          <w:rFonts w:ascii="Sakkal Majalla" w:hAnsi="Sakkal Majalla" w:cs="Sakkal Majalla"/>
+          <w:sz w:val="28"/>
+          <w:szCs w:val="28"/>
+        </w:rPr>
+      </w:pPr>
+      <w:r>
+        <w:rPr>
+          <w:rFonts w:ascii="Sakkal Majalla" w:hAnsi="Sakkal Majalla" w:cs="Sakkal Majalla"/>
+          <w:sz w:val="28"/>
+          <w:szCs w:val="28"/>
+        </w:rPr>
+        <w:lastRenderedPageBreak/>
+        <w:t xml:space="preserve">To insert </w:t>
+      </w:r>
+      <w:r>
+        <w:rPr>
+          <w:rFonts w:ascii="Sakkal Majalla" w:hAnsi="Sakkal Majalla" w:cs="Sakkal Majalla"/>
+          <w:sz w:val="28"/>
+          <w:szCs w:val="28"/>
+        </w:rPr>
+        <w:t xml:space="preserve">a </w:t>
+      </w:r>
+      <w:r>
+        <w:rPr>
+          <w:rFonts w:ascii="Sakkal Majalla" w:hAnsi="Sakkal Majalla" w:cs="Sakkal Majalla"/>
+          <w:sz w:val="28"/>
+          <w:szCs w:val="28"/>
+        </w:rPr>
+        <w:t>chart:</w:t>
+      </w:r>
+    </w:p>
+    <w:p>
+      <w:pPr>
+        <w:pStyle w:val="ListParagraph"/>
+        <w:numPr>
+          <w:ilvl w:val="0"/>
+          <w:numId w:val="2"/>
+        </w:numPr>
+        <w:rPr>
+          <w:rFonts w:ascii="Sakkal Majalla" w:hAnsi="Sakkal Majalla" w:cs="Sakkal Majalla"/>
+          <w:sz w:val="28"/>
+          <w:szCs w:val="28"/>
+        </w:rPr>
+      </w:pPr>
+      <w:r>
+        <w:rPr>
+          <w:rFonts w:ascii="Sakkal Majalla" w:hAnsi="Sakkal Majalla" w:cs="Sakkal Majalla"/>
+          <w:sz w:val="28"/>
+          <w:szCs w:val="28"/>
+        </w:rPr>
+        <w:t>Select the entire data.</w:t>
+      </w:r>
+    </w:p>
+    <w:p>
+      <w:pPr>
+        <w:pStyle w:val="ListParagraph"/>
+        <w:numPr>
+          <w:ilvl w:val="0"/>
+          <w:numId w:val="2"/>
+        </w:numPr>
+        <w:rPr>
+          <w:rFonts w:ascii="Sakkal Majalla" w:hAnsi="Sakkal Majalla" w:cs="Sakkal Majalla"/>
+          <w:sz w:val="28"/>
+          <w:szCs w:val="28"/>
+        </w:rPr>
+      </w:pPr>
+      <w:r>
+        <w:rPr>
+          <w:rFonts w:ascii="Sakkal Majalla" w:hAnsi="Sakkal Majalla" w:cs="Sakkal Majalla"/>
+          <w:sz w:val="28"/>
+          <w:szCs w:val="28"/>
+        </w:rPr>
+        <w:t xml:space="preserve">Select </w:t>
+      </w:r>
+      <w:r>
+        <w:rPr>
+          <w:rFonts w:ascii="Sakkal Majalla" w:hAnsi="Sakkal Majalla" w:cs="Sakkal Majalla"/>
+          <w:b/>
+          <w:bCs/>
+          <w:color w:val="002060"/>
+          <w:sz w:val="28"/>
+          <w:szCs w:val="28"/>
+        </w:rPr>
+        <w:t>insert</w:t>
+      </w:r>
+      <w:r>
+        <w:rPr>
+          <w:rFonts w:ascii="Sakkal Majalla" w:hAnsi="Sakkal Majalla" w:cs="Sakkal Majalla"/>
+          <w:color w:val="002060"/>
+          <w:sz w:val="28"/>
+          <w:szCs w:val="28"/>
+        </w:rPr>
+        <w:t xml:space="preserve"> </w:t>
+      </w:r>
+      <w:r>
+        <w:rPr>
+          <w:rFonts w:ascii="Sakkal Majalla" w:hAnsi="Sakkal Majalla" w:cs="Sakkal Majalla"/>
+          <w:color w:val="C00000"/>
+          <w:sz w:val="28"/>
+          <w:szCs w:val="28"/>
+        </w:rPr>
+        <w:t>=&gt;</w:t>
+      </w:r>
+      <w:r>
+        <w:rPr>
+          <w:rFonts w:ascii="Sakkal Majalla" w:hAnsi="Sakkal Majalla" w:cs="Sakkal Majalla"/>
+          <w:sz w:val="28"/>
+          <w:szCs w:val="28"/>
+        </w:rPr>
+        <w:t xml:space="preserve"> </w:t>
+      </w:r>
+      <w:r>
+        <w:rPr>
+          <w:rFonts w:ascii="Sakkal Majalla" w:hAnsi="Sakkal Majalla" w:cs="Sakkal Majalla"/>
+          <w:b/>
+          <w:bCs/>
+          <w:color w:val="002060"/>
+          <w:sz w:val="28"/>
+          <w:szCs w:val="28"/>
+        </w:rPr>
+        <w:t>Recommended Charts</w:t>
+      </w:r>
+      <w:r>
+        <w:rPr>
+          <w:rFonts w:ascii="Sakkal Majalla" w:hAnsi="Sakkal Majalla" w:cs="Sakkal Majalla"/>
+          <w:sz w:val="28"/>
+          <w:szCs w:val="28"/>
+        </w:rPr>
+        <w:t>.</w:t>
+      </w:r>
+    </w:p>
+    <w:p>
+      <w:pPr>
+        <w:pStyle w:val="ListParagraph"/>
+        <w:numPr>
+          <w:ilvl w:val="0"/>
+          <w:numId w:val="2"/>
+        </w:numPr>
+        <w:rPr>
+          <w:rFonts w:ascii="Sakkal Majalla" w:hAnsi="Sakkal Majalla" w:cs="Sakkal Majalla"/>
+          <w:sz w:val="28"/>
+          <w:szCs w:val="28"/>
+        </w:rPr>
+      </w:pPr>
+      <w:r>
+        <w:rPr>
+          <w:rFonts w:ascii="Sakkal Majalla" w:hAnsi="Sakkal Majalla" w:cs="Sakkal Majalla"/>
+          <w:sz w:val="28"/>
+          <w:szCs w:val="28"/>
+        </w:rPr>
+        <w:t>Choose a chart</w:t>
+      </w:r>
+    </w:p>
+    <w:p>
+      <w:pPr>
+        <w:rPr>
+          <w:rFonts w:ascii="Sakkal Majalla" w:hAnsi="Sakkal Majalla" w:cs="Sakkal Majalla"/>
+          <w:sz w:val="28"/>
+          <w:szCs w:val="28"/>
+        </w:rPr>
+      </w:pPr>
+      <w:r>
+        <w:rPr>
+          <w:noProof/>
+        </w:rPr>
+        <w:drawing>
+          <wp:inline distT="0" distB="0" distL="0" distR="0" wp14:anchorId="20EE57C3" wp14:editId="190678CF">
+            <wp:extent cx="6746789" cy="3600450"/>
+            <wp:effectExtent l="0" t="0" r="0" b="0"/>
+            <wp:docPr id="1151637087" name="Picture 1"/>
+            <wp:cNvGraphicFramePr>
+              <a:graphicFrameLocks xmlns:a="http://schemas.openxmlformats.org/drawingml/2006/main" noChangeAspect="1"/>
+            </wp:cNvGraphicFramePr>
+            <a:graphic xmlns:a="http://schemas.openxmlformats.org/drawingml/2006/main">
+              <a:graphicData uri="http://schemas.openxmlformats.org/drawingml/2006/picture">
+                <pic:pic xmlns:pic="http://schemas.openxmlformats.org/drawingml/2006/picture">
+                  <pic:nvPicPr>
+                    <pic:cNvPr id="1151637087" name=""/>
+                    <pic:cNvPicPr/>
+                  </pic:nvPicPr>
+                  <pic:blipFill>
+                    <a:blip r:embed="rId21"/>
+                    <a:stretch>
+                      <a:fillRect/>
+                    </a:stretch>
+                  </pic:blipFill>
+                  <pic:spPr>
+                    <a:xfrm>
+                      <a:off x="0" y="0"/>
+                      <a:ext cx="6753118" cy="3603827"/>
+                    </a:xfrm>
+                    <a:prstGeom prst="rect">
+                      <a:avLst/>
+                    </a:prstGeom>
+                  </pic:spPr>
+                </pic:pic>
+              </a:graphicData>
+            </a:graphic>
+          </wp:inline>
+        </w:drawing>
+      </w:r>
+    </w:p>
+    <w:p>
+      <w:pPr>
+        <w:ind w:left="1440" w:firstLine="720"/>
+        <w:rPr>
+          <w:rFonts w:ascii="Sakkal Majalla" w:hAnsi="Sakkal Majalla" w:cs="Sakkal Majalla"/>
+          <w:sz w:val="28"/>
+          <w:szCs w:val="28"/>
+        </w:rPr>
+      </w:pPr>
+      <w:r>
+        <w:rPr>
+          <w:rFonts w:ascii="Sakkal Majalla" w:hAnsi="Sakkal Majalla" w:cs="Sakkal Majalla"/>
+          <w:sz w:val="28"/>
+          <w:szCs w:val="28"/>
+        </w:rPr>
+        <w:t>================================================</w:t>
+      </w:r>
     </w:p>
     <w:p>
       <w:pPr>
@@ -738,6 +1889,195 @@
     </w:sectPr>
   </w:body>
 </w:document>
+</file>
+
+<file path=word/numbering.xml><?xml version="1.0" encoding="utf-8"?>
+<w:numbering xmlns:wpc="http://schemas.microsoft.com/office/word/2010/wordprocessingCanvas" xmlns:cx="http://schemas.microsoft.com/office/drawing/2014/chartex" xmlns:cx1="http://schemas.microsoft.com/office/drawing/2015/9/8/chartex" xmlns:cx2="http://schemas.microsoft.com/office/drawing/2015/10/21/chartex" xmlns:cx3="http://schemas.microsoft.com/office/drawing/2016/5/9/chartex" xmlns:cx4="http://schemas.microsoft.com/office/drawing/2016/5/10/chartex" xmlns:cx5="http://schemas.microsoft.com/office/drawing/2016/5/11/chartex" xmlns:cx6="http://schemas.microsoft.com/office/drawing/2016/5/12/chartex" xmlns:cx7="http://schemas.microsoft.com/office/drawing/2016/5/13/chartex" xmlns:cx8="http://schemas.microsoft.com/office/drawing/2016/5/14/chartex" xmlns:mc="http://schemas.openxmlformats.org/markup-compatibility/2006" xmlns:aink="http://schemas.microsoft.com/office/drawing/2016/ink" xmlns:am3d="http://schemas.microsoft.com/office/drawing/2017/model3d" xmlns:o="urn:schemas-microsoft-com:office:office" xmlns:oel="http://schemas.microsoft.com/office/2019/extlst" xmlns:r="http://schemas.openxmlformats.org/officeDocument/2006/relationships" xmlns:m="http://schemas.openxmlformats.org/officeDocument/2006/math" xmlns:v="urn:schemas-microsoft-com:vml" xmlns:wp14="http://schemas.microsoft.com/office/word/2010/wordprocessingDrawing" xmlns:wp="http://schemas.openxmlformats.org/drawingml/2006/wordprocessingDrawing" xmlns:w10="urn:schemas-microsoft-com:office:word" xmlns:w="http://schemas.openxmlformats.org/wordprocessingml/2006/main" xmlns:w14="http://schemas.microsoft.com/office/word/2010/wordml" xmlns:w15="http://schemas.microsoft.com/office/word/2012/wordml" xmlns:w16cex="http://schemas.microsoft.com/office/word/2018/wordml/cex" xmlns:w16cid="http://schemas.microsoft.com/office/word/2016/wordml/cid" xmlns:w16="http://schemas.microsoft.com/office/word/2018/wordml" xmlns:w16du="http://schemas.microsoft.com/office/word/2023/wordml/word16du" xmlns:w16sdtdh="http://schemas.microsoft.com/office/word/2020/wordml/sdtdatahash" xmlns:w16sdtfl="http://schemas.microsoft.com/office/word/2024/wordml/sdtformatlock" xmlns:w16se="http://schemas.microsoft.com/office/word/2015/wordml/symex" xmlns:wpg="http://schemas.microsoft.com/office/word/2010/wordprocessingGroup" xmlns:wpi="http://schemas.microsoft.com/office/word/2010/wordprocessingInk" xmlns:wne="http://schemas.microsoft.com/office/word/2006/wordml" xmlns:wps="http://schemas.microsoft.com/office/word/2010/wordprocessingShape" mc:Ignorable="w14 w15 w16se w16cid w16 w16cex w16sdtdh w16sdtfl w16du wp14">
+  <w:abstractNum w:abstractNumId="0" w15:restartNumberingAfterBreak="0">
+    <w:nsid w:val="08597CAD"/>
+    <w:multiLevelType w:val="hybridMultilevel"/>
+    <w:tmpl w:val="83FE3B66"/>
+    <w:lvl w:ilvl="0" w:tplc="0409000F">
+      <w:start w:val="1"/>
+      <w:numFmt w:val="decimal"/>
+      <w:lvlText w:val="%1."/>
+      <w:lvlJc w:val="left"/>
+      <w:pPr>
+        <w:ind w:left="720" w:hanging="360"/>
+      </w:pPr>
+      <w:rPr>
+        <w:rFonts w:hint="default"/>
+      </w:rPr>
+    </w:lvl>
+    <w:lvl w:ilvl="1" w:tplc="04090019" w:tentative="1">
+      <w:start w:val="1"/>
+      <w:numFmt w:val="lowerLetter"/>
+      <w:lvlText w:val="%2."/>
+      <w:lvlJc w:val="left"/>
+      <w:pPr>
+        <w:ind w:left="1440" w:hanging="360"/>
+      </w:pPr>
+    </w:lvl>
+    <w:lvl w:ilvl="2" w:tplc="0409001B" w:tentative="1">
+      <w:start w:val="1"/>
+      <w:numFmt w:val="lowerRoman"/>
+      <w:lvlText w:val="%3."/>
+      <w:lvlJc w:val="right"/>
+      <w:pPr>
+        <w:ind w:left="2160" w:hanging="180"/>
+      </w:pPr>
+    </w:lvl>
+    <w:lvl w:ilvl="3" w:tplc="0409000F" w:tentative="1">
+      <w:start w:val="1"/>
+      <w:numFmt w:val="decimal"/>
+      <w:lvlText w:val="%4."/>
+      <w:lvlJc w:val="left"/>
+      <w:pPr>
+        <w:ind w:left="2880" w:hanging="360"/>
+      </w:pPr>
+    </w:lvl>
+    <w:lvl w:ilvl="4" w:tplc="04090019" w:tentative="1">
+      <w:start w:val="1"/>
+      <w:numFmt w:val="lowerLetter"/>
+      <w:lvlText w:val="%5."/>
+      <w:lvlJc w:val="left"/>
+      <w:pPr>
+        <w:ind w:left="3600" w:hanging="360"/>
+      </w:pPr>
+    </w:lvl>
+    <w:lvl w:ilvl="5" w:tplc="0409001B" w:tentative="1">
+      <w:start w:val="1"/>
+      <w:numFmt w:val="lowerRoman"/>
+      <w:lvlText w:val="%6."/>
+      <w:lvlJc w:val="right"/>
+      <w:pPr>
+        <w:ind w:left="4320" w:hanging="180"/>
+      </w:pPr>
+    </w:lvl>
+    <w:lvl w:ilvl="6" w:tplc="0409000F" w:tentative="1">
+      <w:start w:val="1"/>
+      <w:numFmt w:val="decimal"/>
+      <w:lvlText w:val="%7."/>
+      <w:lvlJc w:val="left"/>
+      <w:pPr>
+        <w:ind w:left="5040" w:hanging="360"/>
+      </w:pPr>
+    </w:lvl>
+    <w:lvl w:ilvl="7" w:tplc="04090019" w:tentative="1">
+      <w:start w:val="1"/>
+      <w:numFmt w:val="lowerLetter"/>
+      <w:lvlText w:val="%8."/>
+      <w:lvlJc w:val="left"/>
+      <w:pPr>
+        <w:ind w:left="5760" w:hanging="360"/>
+      </w:pPr>
+    </w:lvl>
+    <w:lvl w:ilvl="8" w:tplc="0409001B" w:tentative="1">
+      <w:start w:val="1"/>
+      <w:numFmt w:val="lowerRoman"/>
+      <w:lvlText w:val="%9."/>
+      <w:lvlJc w:val="right"/>
+      <w:pPr>
+        <w:ind w:left="6480" w:hanging="180"/>
+      </w:pPr>
+    </w:lvl>
+  </w:abstractNum>
+  <w:abstractNum w:abstractNumId="1" w15:restartNumberingAfterBreak="0">
+    <w:nsid w:val="557F3AD7"/>
+    <w:multiLevelType w:val="hybridMultilevel"/>
+    <w:tmpl w:val="742C24C4"/>
+    <w:lvl w:ilvl="0" w:tplc="0409000F">
+      <w:start w:val="1"/>
+      <w:numFmt w:val="decimal"/>
+      <w:lvlText w:val="%1."/>
+      <w:lvlJc w:val="left"/>
+      <w:pPr>
+        <w:ind w:left="720" w:hanging="360"/>
+      </w:pPr>
+      <w:rPr>
+        <w:rFonts w:hint="default"/>
+      </w:rPr>
+    </w:lvl>
+    <w:lvl w:ilvl="1" w:tplc="04090019" w:tentative="1">
+      <w:start w:val="1"/>
+      <w:numFmt w:val="lowerLetter"/>
+      <w:lvlText w:val="%2."/>
+      <w:lvlJc w:val="left"/>
+      <w:pPr>
+        <w:ind w:left="1440" w:hanging="360"/>
+      </w:pPr>
+    </w:lvl>
+    <w:lvl w:ilvl="2" w:tplc="0409001B" w:tentative="1">
+      <w:start w:val="1"/>
+      <w:numFmt w:val="lowerRoman"/>
+      <w:lvlText w:val="%3."/>
+      <w:lvlJc w:val="right"/>
+      <w:pPr>
+        <w:ind w:left="2160" w:hanging="180"/>
+      </w:pPr>
+    </w:lvl>
+    <w:lvl w:ilvl="3" w:tplc="0409000F" w:tentative="1">
+      <w:start w:val="1"/>
+      <w:numFmt w:val="decimal"/>
+      <w:lvlText w:val="%4."/>
+      <w:lvlJc w:val="left"/>
+      <w:pPr>
+        <w:ind w:left="2880" w:hanging="360"/>
+      </w:pPr>
+    </w:lvl>
+    <w:lvl w:ilvl="4" w:tplc="04090019" w:tentative="1">
+      <w:start w:val="1"/>
+      <w:numFmt w:val="lowerLetter"/>
+      <w:lvlText w:val="%5."/>
+      <w:lvlJc w:val="left"/>
+      <w:pPr>
+        <w:ind w:left="3600" w:hanging="360"/>
+      </w:pPr>
+    </w:lvl>
+    <w:lvl w:ilvl="5" w:tplc="0409001B" w:tentative="1">
+      <w:start w:val="1"/>
+      <w:numFmt w:val="lowerRoman"/>
+      <w:lvlText w:val="%6."/>
+      <w:lvlJc w:val="right"/>
+      <w:pPr>
+        <w:ind w:left="4320" w:hanging="180"/>
+      </w:pPr>
+    </w:lvl>
+    <w:lvl w:ilvl="6" w:tplc="0409000F" w:tentative="1">
+      <w:start w:val="1"/>
+      <w:numFmt w:val="decimal"/>
+      <w:lvlText w:val="%7."/>
+      <w:lvlJc w:val="left"/>
+      <w:pPr>
+        <w:ind w:left="5040" w:hanging="360"/>
+      </w:pPr>
+    </w:lvl>
+    <w:lvl w:ilvl="7" w:tplc="04090019" w:tentative="1">
+      <w:start w:val="1"/>
+      <w:numFmt w:val="lowerLetter"/>
+      <w:lvlText w:val="%8."/>
+      <w:lvlJc w:val="left"/>
+      <w:pPr>
+        <w:ind w:left="5760" w:hanging="360"/>
+      </w:pPr>
+    </w:lvl>
+    <w:lvl w:ilvl="8" w:tplc="0409001B" w:tentative="1">
+      <w:start w:val="1"/>
+      <w:numFmt w:val="lowerRoman"/>
+      <w:lvlText w:val="%9."/>
+      <w:lvlJc w:val="right"/>
+      <w:pPr>
+        <w:ind w:left="6480" w:hanging="180"/>
+      </w:pPr>
+    </w:lvl>
+  </w:abstractNum>
+  <w:num w:numId="1" w16cid:durableId="1999572503">
+    <w:abstractNumId w:val="1"/>
+  </w:num>
+  <w:num w:numId="2" w16cid:durableId="1662151968">
+    <w:abstractNumId w:val="0"/>
+  </w:num>
+</w:numbering>
 </file>
 
 <file path=word/styles.xml><?xml version="1.0" encoding="utf-8"?>

</xml_diff>